<commit_message>
Match Churches' Verdana font
Extracted via pdffonts on the four source forms — all of them
use Verdana / Verdana-Bold. Universal Microsoft font that ships
with Windows and macOS, so every engineer's Word renders the
template the same way. Wider than Calibri so the layout might
breathe slightly differently on page 1 of the commissioning
cert; will retune if it overflows.
</commit_message>
<xml_diff>
--- a/assets/bs5839-acceptance-cert-template.docx
+++ b/assets/bs5839-acceptance-cert-template.docx
@@ -49,7 +49,7 @@
       </w:pPr>
       <w:r>
         <w:rPr>
-          <w:rFonts w:ascii="Calibri" w:hAnsi="Calibri"/>
+          <w:rFonts w:ascii="Verdana" w:hAnsi="Verdana"/>
           <w:b/>
           <w:color w:val="1A1F2C"/>
           <w:sz w:val="28"/>
@@ -92,7 +92,7 @@
             </w:pPr>
             <w:r>
               <w:rPr>
-                <w:rFonts w:ascii="Calibri" w:hAnsi="Calibri"/>
+                <w:rFonts w:ascii="Verdana" w:hAnsi="Verdana"/>
                 <w:b/>
                 <w:color w:val="E03E3E"/>
                 <w:sz w:val="20"/>
@@ -127,7 +127,7 @@
                 <w:p>
                   <w:r>
                     <w:rPr>
-                      <w:rFonts w:ascii="Calibri" w:hAnsi="Calibri"/>
+                      <w:rFonts w:ascii="Verdana" w:hAnsi="Verdana"/>
                       <w:color w:val="E03E3E"/>
                       <w:sz w:val="18"/>
                     </w:rPr>
@@ -156,7 +156,7 @@
                 <w:p>
                   <w:r>
                     <w:rPr>
-                      <w:rFonts w:ascii="Calibri" w:hAnsi="Calibri"/>
+                      <w:rFonts w:ascii="Verdana" w:hAnsi="Verdana"/>
                       <w:color w:val="1A1F2C"/>
                       <w:sz w:val="20"/>
                     </w:rPr>
@@ -194,7 +194,7 @@
                 <w:p>
                   <w:r>
                     <w:rPr>
-                      <w:rFonts w:ascii="Calibri" w:hAnsi="Calibri"/>
+                      <w:rFonts w:ascii="Verdana" w:hAnsi="Verdana"/>
                       <w:color w:val="E03E3E"/>
                       <w:sz w:val="18"/>
                     </w:rPr>
@@ -223,7 +223,7 @@
                 <w:p>
                   <w:r>
                     <w:rPr>
-                      <w:rFonts w:ascii="Calibri" w:hAnsi="Calibri"/>
+                      <w:rFonts w:ascii="Verdana" w:hAnsi="Verdana"/>
                       <w:color w:val="1A1F2C"/>
                       <w:sz w:val="20"/>
                     </w:rPr>
@@ -240,7 +240,7 @@
             </w:pPr>
             <w:r>
               <w:rPr>
-                <w:rFonts w:ascii="Calibri" w:hAnsi="Calibri"/>
+                <w:rFonts w:ascii="Verdana" w:hAnsi="Verdana"/>
                 <w:i w:val="0"/>
                 <w:color w:val="1A1F2C"/>
                 <w:sz w:val="18"/>
@@ -277,7 +277,7 @@
                 <w:p>
                   <w:r>
                     <w:rPr>
-                      <w:rFonts w:ascii="Calibri" w:hAnsi="Calibri"/>
+                      <w:rFonts w:ascii="Verdana" w:hAnsi="Verdana"/>
                       <w:color w:val="E03E3E"/>
                       <w:sz w:val="18"/>
                     </w:rPr>
@@ -306,7 +306,7 @@
                 <w:p>
                   <w:r>
                     <w:rPr>
-                      <w:rFonts w:ascii="Calibri" w:hAnsi="Calibri"/>
+                      <w:rFonts w:ascii="Verdana" w:hAnsi="Verdana"/>
                       <w:color w:val="1A1F2C"/>
                       <w:sz w:val="20"/>
                     </w:rPr>
@@ -322,7 +322,7 @@
                 <w:p>
                   <w:r>
                     <w:rPr>
-                      <w:rFonts w:ascii="Calibri" w:hAnsi="Calibri"/>
+                      <w:rFonts w:ascii="Verdana" w:hAnsi="Verdana"/>
                       <w:color w:val="E03E3E"/>
                       <w:sz w:val="18"/>
                     </w:rPr>
@@ -351,7 +351,7 @@
                 <w:p>
                   <w:r>
                     <w:rPr>
-                      <w:rFonts w:ascii="Calibri" w:hAnsi="Calibri"/>
+                      <w:rFonts w:ascii="Verdana" w:hAnsi="Verdana"/>
                       <w:color w:val="1A1F2C"/>
                       <w:sz w:val="20"/>
                     </w:rPr>
@@ -391,7 +391,7 @@
                 <w:p>
                   <w:r>
                     <w:rPr>
-                      <w:rFonts w:ascii="Calibri" w:hAnsi="Calibri"/>
+                      <w:rFonts w:ascii="Verdana" w:hAnsi="Verdana"/>
                       <w:color w:val="E03E3E"/>
                       <w:sz w:val="18"/>
                     </w:rPr>
@@ -420,7 +420,7 @@
                 <w:p>
                   <w:r>
                     <w:rPr>
-                      <w:rFonts w:ascii="Calibri" w:hAnsi="Calibri"/>
+                      <w:rFonts w:ascii="Verdana" w:hAnsi="Verdana"/>
                       <w:color w:val="1A1F2C"/>
                       <w:sz w:val="20"/>
                     </w:rPr>
@@ -436,7 +436,7 @@
                 <w:p>
                   <w:r>
                     <w:rPr>
-                      <w:rFonts w:ascii="Calibri" w:hAnsi="Calibri"/>
+                      <w:rFonts w:ascii="Verdana" w:hAnsi="Verdana"/>
                       <w:color w:val="E03E3E"/>
                       <w:sz w:val="18"/>
                     </w:rPr>
@@ -465,7 +465,7 @@
                 <w:p>
                   <w:r>
                     <w:rPr>
-                      <w:rFonts w:ascii="Calibri" w:hAnsi="Calibri"/>
+                      <w:rFonts w:ascii="Verdana" w:hAnsi="Verdana"/>
                       <w:color w:val="1A1F2C"/>
                       <w:sz w:val="20"/>
                     </w:rPr>
@@ -503,7 +503,7 @@
                 <w:p>
                   <w:r>
                     <w:rPr>
-                      <w:rFonts w:ascii="Calibri" w:hAnsi="Calibri"/>
+                      <w:rFonts w:ascii="Verdana" w:hAnsi="Verdana"/>
                       <w:color w:val="E03E3E"/>
                       <w:sz w:val="18"/>
                     </w:rPr>
@@ -532,7 +532,7 @@
                 <w:p>
                   <w:r>
                     <w:rPr>
-                      <w:rFonts w:ascii="Calibri" w:hAnsi="Calibri"/>
+                      <w:rFonts w:ascii="Verdana" w:hAnsi="Verdana"/>
                       <w:color w:val="1A1F2C"/>
                       <w:sz w:val="20"/>
                     </w:rPr>
@@ -591,7 +591,7 @@
             </w:pPr>
             <w:r>
               <w:rPr>
-                <w:rFonts w:ascii="Calibri" w:hAnsi="Calibri"/>
+                <w:rFonts w:ascii="Verdana" w:hAnsi="Verdana"/>
                 <w:b/>
                 <w:color w:val="E03E3E"/>
                 <w:sz w:val="20"/>
@@ -626,7 +626,7 @@
                 <w:p>
                   <w:r>
                     <w:rPr>
-                      <w:rFonts w:ascii="Calibri" w:hAnsi="Calibri"/>
+                      <w:rFonts w:ascii="Verdana" w:hAnsi="Verdana"/>
                       <w:color w:val="E03E3E"/>
                       <w:sz w:val="18"/>
                     </w:rPr>
@@ -655,7 +655,7 @@
                 <w:p>
                   <w:r>
                     <w:rPr>
-                      <w:rFonts w:ascii="Calibri" w:hAnsi="Calibri"/>
+                      <w:rFonts w:ascii="Verdana" w:hAnsi="Verdana"/>
                       <w:color w:val="1A1F2C"/>
                       <w:sz w:val="20"/>
                     </w:rPr>
@@ -714,7 +714,7 @@
             </w:pPr>
             <w:r>
               <w:rPr>
-                <w:rFonts w:ascii="Calibri" w:hAnsi="Calibri"/>
+                <w:rFonts w:ascii="Verdana" w:hAnsi="Verdana"/>
                 <w:b/>
                 <w:color w:val="E03E3E"/>
                 <w:sz w:val="20"/>
@@ -818,7 +818,7 @@
             </w:pPr>
             <w:r>
               <w:rPr>
-                <w:rFonts w:ascii="Calibri" w:hAnsi="Calibri"/>
+                <w:rFonts w:ascii="Verdana" w:hAnsi="Verdana"/>
                 <w:b/>
                 <w:color w:val="E03E3E"/>
                 <w:sz w:val="20"/>
@@ -924,7 +924,7 @@
             </w:pPr>
             <w:r>
               <w:rPr>
-                <w:rFonts w:ascii="Calibri" w:hAnsi="Calibri"/>
+                <w:rFonts w:ascii="Verdana" w:hAnsi="Verdana"/>
                 <w:b/>
                 <w:color w:val="E03E3E"/>
                 <w:sz w:val="20"/>
@@ -961,7 +961,7 @@
                 <w:p>
                   <w:r>
                     <w:rPr>
-                      <w:rFonts w:ascii="Calibri" w:hAnsi="Calibri"/>
+                      <w:rFonts w:ascii="Verdana" w:hAnsi="Verdana"/>
                       <w:color w:val="E03E3E"/>
                       <w:sz w:val="18"/>
                     </w:rPr>
@@ -990,7 +990,7 @@
                 <w:p>
                   <w:r>
                     <w:rPr>
-                      <w:rFonts w:ascii="Calibri" w:hAnsi="Calibri"/>
+                      <w:rFonts w:ascii="Verdana" w:hAnsi="Verdana"/>
                       <w:color w:val="1A1F2C"/>
                       <w:sz w:val="20"/>
                     </w:rPr>
@@ -1006,7 +1006,7 @@
                 <w:p>
                   <w:r>
                     <w:rPr>
-                      <w:rFonts w:ascii="Calibri" w:hAnsi="Calibri"/>
+                      <w:rFonts w:ascii="Verdana" w:hAnsi="Verdana"/>
                       <w:color w:val="E03E3E"/>
                       <w:sz w:val="18"/>
                     </w:rPr>
@@ -1035,7 +1035,7 @@
                 <w:p>
                   <w:r>
                     <w:rPr>
-                      <w:rFonts w:ascii="Calibri" w:hAnsi="Calibri"/>
+                      <w:rFonts w:ascii="Verdana" w:hAnsi="Verdana"/>
                       <w:color w:val="1A1F2C"/>
                       <w:sz w:val="20"/>
                     </w:rPr>
@@ -1075,7 +1075,7 @@
                 <w:p>
                   <w:r>
                     <w:rPr>
-                      <w:rFonts w:ascii="Calibri" w:hAnsi="Calibri"/>
+                      <w:rFonts w:ascii="Verdana" w:hAnsi="Verdana"/>
                       <w:color w:val="E03E3E"/>
                       <w:sz w:val="18"/>
                     </w:rPr>
@@ -1104,7 +1104,7 @@
                 <w:p>
                   <w:r>
                     <w:rPr>
-                      <w:rFonts w:ascii="Calibri" w:hAnsi="Calibri"/>
+                      <w:rFonts w:ascii="Verdana" w:hAnsi="Verdana"/>
                       <w:color w:val="1A1F2C"/>
                       <w:sz w:val="20"/>
                     </w:rPr>
@@ -1120,7 +1120,7 @@
                 <w:p>
                   <w:r>
                     <w:rPr>
-                      <w:rFonts w:ascii="Calibri" w:hAnsi="Calibri"/>
+                      <w:rFonts w:ascii="Verdana" w:hAnsi="Verdana"/>
                       <w:color w:val="E03E3E"/>
                       <w:sz w:val="18"/>
                     </w:rPr>
@@ -1149,7 +1149,7 @@
                 <w:p>
                   <w:r>
                     <w:rPr>
-                      <w:rFonts w:ascii="Calibri" w:hAnsi="Calibri"/>
+                      <w:rFonts w:ascii="Verdana" w:hAnsi="Verdana"/>
                       <w:color w:val="1A1F2C"/>
                       <w:sz w:val="20"/>
                     </w:rPr>
@@ -1215,7 +1215,7 @@
             </w:pPr>
             <w:r>
               <w:rPr>
-                <w:rFonts w:ascii="Calibri" w:hAnsi="Calibri"/>
+                <w:rFonts w:ascii="Verdana" w:hAnsi="Verdana"/>
                 <w:i w:val="0"/>
                 <w:color w:val="1A1F2C"/>
                 <w:sz w:val="18"/>
@@ -1229,7 +1229,7 @@
             </w:pPr>
             <w:r>
               <w:rPr>
-                <w:rFonts w:ascii="Calibri" w:hAnsi="Calibri"/>
+                <w:rFonts w:ascii="Verdana" w:hAnsi="Verdana"/>
                 <w:i w:val="0"/>
                 <w:color w:val="1A1F2C"/>
                 <w:sz w:val="18"/>
@@ -1243,7 +1243,7 @@
             </w:pPr>
             <w:r>
               <w:rPr>
-                <w:rFonts w:ascii="Calibri" w:hAnsi="Calibri"/>
+                <w:rFonts w:ascii="Verdana" w:hAnsi="Verdana"/>
                 <w:i w:val="0"/>
                 <w:color w:val="1A1F2C"/>
                 <w:sz w:val="18"/>
@@ -1299,7 +1299,7 @@
             </w:pPr>
             <w:r>
               <w:rPr>
-                <w:rFonts w:ascii="Calibri" w:hAnsi="Calibri"/>
+                <w:rFonts w:ascii="Verdana" w:hAnsi="Verdana"/>
                 <w:b/>
                 <w:color w:val="E03E3E"/>
                 <w:sz w:val="20"/>
@@ -1313,7 +1313,7 @@
             </w:pPr>
             <w:r>
               <w:rPr>
-                <w:rFonts w:ascii="Calibri" w:hAnsi="Calibri"/>
+                <w:rFonts w:ascii="Verdana" w:hAnsi="Verdana"/>
                 <w:i w:val="0"/>
                 <w:color w:val="1A1F2C"/>
                 <w:sz w:val="18"/>
@@ -1327,7 +1327,7 @@
             </w:pPr>
             <w:r>
               <w:rPr>
-                <w:rFonts w:ascii="Calibri" w:hAnsi="Calibri"/>
+                <w:rFonts w:ascii="Verdana" w:hAnsi="Verdana"/>
                 <w:i w:val="0"/>
                 <w:color w:val="1A1F2C"/>
                 <w:sz w:val="18"/>
@@ -1341,7 +1341,7 @@
             </w:pPr>
             <w:r>
               <w:rPr>
-                <w:rFonts w:ascii="Calibri" w:hAnsi="Calibri"/>
+                <w:rFonts w:ascii="Verdana" w:hAnsi="Verdana"/>
                 <w:i w:val="0"/>
                 <w:color w:val="1A1F2C"/>
                 <w:sz w:val="18"/>
@@ -1355,7 +1355,7 @@
             </w:pPr>
             <w:r>
               <w:rPr>
-                <w:rFonts w:ascii="Calibri" w:hAnsi="Calibri"/>
+                <w:rFonts w:ascii="Verdana" w:hAnsi="Verdana"/>
                 <w:i w:val="0"/>
                 <w:color w:val="1A1F2C"/>
                 <w:sz w:val="18"/>
@@ -1369,7 +1369,7 @@
             </w:pPr>
             <w:r>
               <w:rPr>
-                <w:rFonts w:ascii="Calibri" w:hAnsi="Calibri"/>
+                <w:rFonts w:ascii="Verdana" w:hAnsi="Verdana"/>
                 <w:i w:val="0"/>
                 <w:color w:val="1A1F2C"/>
                 <w:sz w:val="18"/>
@@ -1383,7 +1383,7 @@
             </w:pPr>
             <w:r>
               <w:rPr>
-                <w:rFonts w:ascii="Calibri" w:hAnsi="Calibri"/>
+                <w:rFonts w:ascii="Verdana" w:hAnsi="Verdana"/>
                 <w:i w:val="0"/>
                 <w:color w:val="1A1F2C"/>
                 <w:sz w:val="18"/>
@@ -1440,7 +1440,7 @@
             </w:pPr>
             <w:r>
               <w:rPr>
-                <w:rFonts w:ascii="Calibri" w:hAnsi="Calibri"/>
+                <w:rFonts w:ascii="Verdana" w:hAnsi="Verdana"/>
                 <w:b/>
                 <w:color w:val="FFFFFF"/>
                 <w:sz w:val="22"/>
@@ -1825,7 +1825,7 @@
     <w:qFormat/>
     <w:rsid w:val="00FC693F"/>
     <w:rPr>
-      <w:rFonts w:ascii="Calibri" w:hAnsi="Calibri"/>
+      <w:rFonts w:ascii="Verdana" w:hAnsi="Verdana"/>
       <w:sz w:val="20"/>
     </w:rPr>
   </w:style>

</xml_diff>